<commit_message>
updated grind variant documentation
</commit_message>
<xml_diff>
--- a/AMS-AGY_v3_grind_variants.docx
+++ b/AMS-AGY_v3_grind_variants.docx
@@ -1,10 +1,9 @@
 
 <file path=word/document.xml><?xml version="1.0" encoding="utf-8"?>
-<w:document xmlns:o="urn:schemas-microsoft-com:office:office" xmlns:r="http://schemas.openxmlformats.org/officeDocument/2006/relationships" xmlns:v="urn:schemas-microsoft-com:vml" xmlns:w="http://schemas.openxmlformats.org/wordprocessingml/2006/main" xmlns:w10="urn:schemas-microsoft-com:office:word" xmlns:wp="http://schemas.openxmlformats.org/drawingml/2006/wordprocessingDrawing" xmlns:pic="http://schemas.openxmlformats.org/drawingml/2006/picture" xmlns:wps="http://schemas.microsoft.com/office/word/2010/wordprocessingShape" xmlns:wpg="http://schemas.microsoft.com/office/word/2010/wordprocessingGroup" xmlns:mc="http://schemas.openxmlformats.org/markup-compatibility/2006" xmlns:wp14="http://schemas.microsoft.com/office/word/2010/wordprocessingDrawing" xmlns:w14="http://schemas.microsoft.com/office/word/2010/wordml" xmlns:w15="http://schemas.microsoft.com/office/word/2012/wordml" mc:Ignorable="w14 wp14 w15">
+<w:document xmlns:wpc="http://schemas.microsoft.com/office/word/2010/wordprocessingCanvas" xmlns:cx="http://schemas.microsoft.com/office/drawing/2014/chartex" xmlns:cx1="http://schemas.microsoft.com/office/drawing/2015/9/8/chartex" xmlns:cx2="http://schemas.microsoft.com/office/drawing/2015/10/21/chartex" xmlns:cx3="http://schemas.microsoft.com/office/drawing/2016/5/9/chartex" xmlns:cx4="http://schemas.microsoft.com/office/drawing/2016/5/10/chartex" xmlns:cx5="http://schemas.microsoft.com/office/drawing/2016/5/11/chartex" xmlns:cx6="http://schemas.microsoft.com/office/drawing/2016/5/12/chartex" xmlns:cx7="http://schemas.microsoft.com/office/drawing/2016/5/13/chartex" xmlns:cx8="http://schemas.microsoft.com/office/drawing/2016/5/14/chartex" xmlns:mc="http://schemas.openxmlformats.org/markup-compatibility/2006" xmlns:aink="http://schemas.microsoft.com/office/drawing/2016/ink" xmlns:am3d="http://schemas.microsoft.com/office/drawing/2017/model3d" xmlns:o="urn:schemas-microsoft-com:office:office" xmlns:oel="http://schemas.microsoft.com/office/2019/extlst" xmlns:r="http://schemas.openxmlformats.org/officeDocument/2006/relationships" xmlns:m="http://schemas.openxmlformats.org/officeDocument/2006/math" xmlns:v="urn:schemas-microsoft-com:vml" xmlns:wp14="http://schemas.microsoft.com/office/word/2010/wordprocessingDrawing" xmlns:wp="http://schemas.openxmlformats.org/drawingml/2006/wordprocessingDrawing" xmlns:w10="urn:schemas-microsoft-com:office:word" xmlns:w="http://schemas.openxmlformats.org/wordprocessingml/2006/main" xmlns:w14="http://schemas.microsoft.com/office/word/2010/wordml" xmlns:w15="http://schemas.microsoft.com/office/word/2012/wordml" xmlns:w16cex="http://schemas.microsoft.com/office/word/2018/wordml/cex" xmlns:w16cid="http://schemas.microsoft.com/office/word/2016/wordml/cid" xmlns:w16="http://schemas.microsoft.com/office/word/2018/wordml" xmlns:w16du="http://schemas.microsoft.com/office/word/2023/wordml/word16du" xmlns:w16sdtdh="http://schemas.microsoft.com/office/word/2020/wordml/sdtdatahash" xmlns:w16sdtfl="http://schemas.microsoft.com/office/word/2024/wordml/sdtformatlock" xmlns:w16se="http://schemas.microsoft.com/office/word/2015/wordml/symex" xmlns:wpg="http://schemas.microsoft.com/office/word/2010/wordprocessingGroup" xmlns:wpi="http://schemas.microsoft.com/office/word/2010/wordprocessingInk" xmlns:wne="http://schemas.microsoft.com/office/word/2006/wordml" xmlns:wps="http://schemas.microsoft.com/office/word/2010/wordprocessingShape" mc:Ignorable="w14 w15 w16se w16cid w16 w16cex w16sdtdh w16sdtfl w16du wp14">
   <w:body>
     <w:p>
       <w:pPr>
-        <w:pStyle w:val="Normal"/>
         <w:rPr>
           <w:b/>
           <w:bCs/>
@@ -15,110 +14,290 @@
           <w:b/>
           <w:bCs/>
         </w:rPr>
-        <w:t>Two grind options on AMS-AGY v3</w:t>
-      </w:r>
-    </w:p>
-    <w:p>
-      <w:pPr>
-        <w:pStyle w:val="Normal"/>
-        <w:rPr/>
-      </w:pPr>
-      <w:r>
-        <w:rPr/>
-        <w:t>There are two variants of the 57-14-7 AMS-AGY v3 objective.  The only difference is the placement of the grind which allows the AMS-AGY objective to be co-focused with the O2 objective.  We call them “250 µm grind” and “900 µm grind” variants.</w:t>
-      </w:r>
-    </w:p>
-    <w:p>
-      <w:pPr>
-        <w:pStyle w:val="Normal"/>
-        <w:rPr/>
-      </w:pPr>
-      <w:r>
-        <w:rPr/>
-        <w:t>As a general rule, customers using a 40x/0.95 objective as O2 will prefer the “250 µm grind” variant, and all other customers will prefer the “900 µm grind” variant.</w:t>
-      </w:r>
-    </w:p>
-    <w:p>
-      <w:pPr>
-        <w:pStyle w:val="Normal"/>
-        <w:rPr/>
-      </w:pPr>
-      <w:r>
-        <w:rPr/>
-        <w:t>Due to the short working distance of 40x/0.95 objectives, in order to co-focus with the AMS-AGY v3 objective part of its optical FOV needs to be sacrificed.  In the “250 µm grind” variant, the optical FOV is truncated along a line which passes 125 µm from the center of the objective.  Along the other directions the full FOV remains.</w:t>
-      </w:r>
-    </w:p>
-    <w:p>
-      <w:pPr>
-        <w:pStyle w:val="Normal"/>
-        <w:rPr/>
-      </w:pPr>
-      <w:r>
-        <w:rPr/>
-        <w:t>In the “900 µm grind” variant, the glass removed with the grind falls outside of the diffraction-limited FOV.  This version can co-focus 20x/0.8 O2 objectives from Nikon, Olympus, and Leica.  In this variant the glass is truncated such that the semi-FOV is 450 µm instead of 125 µm.</w:t>
-      </w:r>
-    </w:p>
-    <w:p>
-      <w:pPr>
-        <w:pStyle w:val="Normal"/>
-        <w:rPr/>
-      </w:pPr>
-      <w:r>
-        <w:rPr/>
-        <w:t xml:space="preserve">Due to the non-zero WD, the grind positions are 35 µm </w:t>
-      </w:r>
-      <w:r>
-        <w:rPr/>
-        <w:t xml:space="preserve">(= </w:t>
-      </w:r>
-      <w:r>
-        <w:rPr/>
-        <w:t>5 µm * tan(arcsin(0.99))</w:t>
-      </w:r>
-      <w:r>
-        <w:rPr/>
-        <w:t>)</w:t>
-      </w:r>
-      <w:r>
-        <w:rPr/>
-        <w:t xml:space="preserve"> larger mechanically than optically (160 µm and 485 µm from the mechanical centerline).  </w:t>
-      </w:r>
-    </w:p>
-    <w:p>
-      <w:pPr>
-        <w:pStyle w:val="Normal"/>
-        <w:rPr/>
-      </w:pPr>
-      <w:r>
-        <w:rPr/>
-        <w:t>This diagram depicts the possible collision of O2 and O3 when O3 is rotated about its centerline, pushing the truncated portion of the AMS-AGY objective toward O2:</w:t>
-      </w:r>
-    </w:p>
-    <w:p>
-      <w:pPr>
-        <w:pStyle w:val="Normal"/>
-        <w:rPr/>
-      </w:pPr>
-      <w:r>
-        <w:rPr/>
-      </w:r>
-    </w:p>
-    <w:p>
-      <w:pPr>
-        <w:pStyle w:val="Normal"/>
-        <w:spacing w:before="0" w:after="160"/>
+        <w:t>T</w:t>
+      </w:r>
+      <w:r>
         <w:rPr>
           <w:b/>
           <w:bCs/>
         </w:rPr>
-      </w:pPr>
-      <w:r>
-        <w:rPr/>
+        <w:t xml:space="preserve">wo grind options on </w:t>
+      </w:r>
+      <w:r>
+        <w:rPr>
+          <w:b/>
+          <w:bCs/>
+        </w:rPr>
+        <w:t xml:space="preserve">AMS-AGY </w:t>
+      </w:r>
+      <w:r>
+        <w:rPr>
+          <w:b/>
+          <w:bCs/>
+        </w:rPr>
+        <w:t>v3</w:t>
+      </w:r>
+    </w:p>
+    <w:p>
+      <w:r>
+        <w:t>There are two variants of the 57-14-7 AMS-AGY v3 objective</w:t>
+      </w:r>
+      <w:r>
+        <w:t xml:space="preserve">.  The only difference is the </w:t>
+      </w:r>
+      <w:r>
+        <w:t>placement of the grind</w:t>
+      </w:r>
+      <w:r>
+        <w:t xml:space="preserve"> which </w:t>
+      </w:r>
+      <w:r>
+        <w:t xml:space="preserve">allows the AMS-AGY objective </w:t>
+      </w:r>
+      <w:r>
+        <w:t xml:space="preserve">to be co-focused with </w:t>
+      </w:r>
+      <w:r>
+        <w:t>the O2</w:t>
+      </w:r>
+      <w:r>
+        <w:t xml:space="preserve"> objective</w:t>
+      </w:r>
+      <w:r>
+        <w:t xml:space="preserve">.  </w:t>
+      </w:r>
+      <w:r>
+        <w:t xml:space="preserve">We call them </w:t>
+      </w:r>
+      <w:r>
+        <w:t>“250 µm</w:t>
+      </w:r>
+      <w:r>
+        <w:t xml:space="preserve"> grind</w:t>
+      </w:r>
+      <w:r>
+        <w:t>” and “900 µm</w:t>
+      </w:r>
+      <w:r>
+        <w:t xml:space="preserve"> grind</w:t>
+      </w:r>
+      <w:r>
+        <w:t>”</w:t>
+      </w:r>
+      <w:r>
+        <w:t xml:space="preserve"> variants</w:t>
+      </w:r>
+      <w:r>
+        <w:t>, designated on paperwork with internal PNs ending in -02 or -0</w:t>
+      </w:r>
+      <w:r>
+        <w:t xml:space="preserve">1 respectively.  </w:t>
+      </w:r>
+      <w:r>
+        <w:rPr>
+          <w:b/>
+          <w:bCs/>
+        </w:rPr>
+        <w:t>As a general rule, customers using a 40x/0.95 objective as O2 will prefer the “250 µm grind” variant, and all other customers will prefer the “900 µm grind” variant.</w:t>
+      </w:r>
+    </w:p>
+    <w:p>
+      <w:r>
+        <w:t xml:space="preserve">Due to the short working distance of </w:t>
+      </w:r>
+      <w:r>
+        <w:t>40x/0.95 objectives</w:t>
+      </w:r>
+      <w:r>
+        <w:t xml:space="preserve">, </w:t>
+      </w:r>
+      <w:r>
+        <w:t>in order to co-focus with the AMS-AGY v3 objective part of its optical FOV needs to be sacrificed.  In the “250 µm grind” variant, t</w:t>
+      </w:r>
+      <w:r>
+        <w:t xml:space="preserve">he </w:t>
+      </w:r>
+      <w:r>
+        <w:t xml:space="preserve">optical </w:t>
+      </w:r>
+      <w:r>
+        <w:t>FOV is truncated along a line</w:t>
+      </w:r>
+      <w:r>
+        <w:t xml:space="preserve"> which passes</w:t>
+      </w:r>
+      <w:r>
+        <w:t xml:space="preserve"> 125</w:t>
+      </w:r>
+      <w:r>
+        <w:t> µm</w:t>
+      </w:r>
+      <w:r>
+        <w:t xml:space="preserve"> from the center of the </w:t>
+      </w:r>
+      <w:r>
+        <w:t>objective</w:t>
+      </w:r>
+      <w:r>
+        <w:t>.  Along the other directions the full FOV remains</w:t>
+      </w:r>
+      <w:r>
+        <w:t>.</w:t>
+      </w:r>
+    </w:p>
+    <w:p>
+      <w:r>
+        <w:t>In the “900 </w:t>
+      </w:r>
+      <w:r>
+        <w:t>µm</w:t>
+      </w:r>
+      <w:r>
+        <w:t xml:space="preserve"> grind”</w:t>
+      </w:r>
+      <w:r>
+        <w:t xml:space="preserve"> variant,</w:t>
+      </w:r>
+      <w:r>
+        <w:t xml:space="preserve"> the glass </w:t>
+      </w:r>
+      <w:r>
+        <w:t xml:space="preserve">removed with the grind </w:t>
+      </w:r>
+      <w:r>
+        <w:t xml:space="preserve">falls </w:t>
+      </w:r>
+      <w:r>
+        <w:t xml:space="preserve">outside of the diffraction-limited FOV.  </w:t>
+      </w:r>
+      <w:r>
+        <w:t xml:space="preserve">This version </w:t>
+      </w:r>
+      <w:r>
+        <w:t xml:space="preserve">can co-focus </w:t>
+      </w:r>
+      <w:r>
+        <w:t xml:space="preserve">20x/0.8 O2 objectives from </w:t>
+      </w:r>
+      <w:r>
+        <w:t>Nikon, Olympus, and Leica</w:t>
+      </w:r>
+      <w:r>
+        <w:t xml:space="preserve">.  </w:t>
+      </w:r>
+      <w:r>
+        <w:t>In this variant t</w:t>
+      </w:r>
+      <w:r>
+        <w:t xml:space="preserve">he </w:t>
+      </w:r>
+      <w:r>
+        <w:t xml:space="preserve">glass is truncated </w:t>
+      </w:r>
+      <w:r>
+        <w:t>such that the semi-FOV is 450</w:t>
+      </w:r>
+      <w:r>
+        <w:t> </w:t>
+      </w:r>
+      <w:r>
+        <w:t>µm</w:t>
+      </w:r>
+      <w:r>
+        <w:t xml:space="preserve"> instead of 125</w:t>
+      </w:r>
+      <w:r>
+        <w:t> </w:t>
+      </w:r>
+      <w:r>
+        <w:t>µm</w:t>
+      </w:r>
+      <w:r>
+        <w:t>.</w:t>
+      </w:r>
+    </w:p>
+    <w:p>
+      <w:r>
+        <w:t>Due to the non-zero WD, the grind positions are</w:t>
+      </w:r>
+      <w:r>
+        <w:t xml:space="preserve"> </w:t>
+      </w:r>
+      <w:r>
+        <w:t xml:space="preserve">35 µm </w:t>
+      </w:r>
+      <w:r>
+        <w:t xml:space="preserve">larger </w:t>
+      </w:r>
+      <w:r>
+        <w:t xml:space="preserve">mechanically than optically </w:t>
+      </w:r>
+      <w:r>
+        <w:t>(160</w:t>
+      </w:r>
+      <w:r>
+        <w:t> </w:t>
+      </w:r>
+      <w:r>
+        <w:t>µm</w:t>
+      </w:r>
+      <w:r>
+        <w:t xml:space="preserve"> and </w:t>
+      </w:r>
+      <w:r>
+        <w:t>485</w:t>
+      </w:r>
+      <w:r>
+        <w:t> </w:t>
+      </w:r>
+      <w:r>
+        <w:t>µm</w:t>
+      </w:r>
+      <w:r>
+        <w:t xml:space="preserve"> from the mechanical centerline</w:t>
+      </w:r>
+      <w:r>
+        <w:t>)</w:t>
+      </w:r>
+      <w:r>
+        <w:t xml:space="preserve">.  </w:t>
+      </w:r>
+    </w:p>
+    <w:p>
+      <w:r>
+        <w:t xml:space="preserve">This diagram depicts the possible </w:t>
+      </w:r>
+      <w:r>
+        <w:t xml:space="preserve">collision of O2 and O3 </w:t>
+      </w:r>
+      <w:r>
+        <w:t xml:space="preserve">when </w:t>
+      </w:r>
+      <w:r>
+        <w:t xml:space="preserve">O3 is rotated about its centerline, pushing the </w:t>
+      </w:r>
+      <w:r>
+        <w:t xml:space="preserve">truncated portion of the AMS-AGY objective </w:t>
+      </w:r>
+      <w:r>
+        <w:t>toward O2</w:t>
+      </w:r>
+      <w:r>
+        <w:t>:</w:t>
+      </w:r>
+    </w:p>
+    <w:p>
+      <w:r>
+        <w:rPr>
+          <w:b/>
+          <w:bCs/>
+          <w:noProof/>
+        </w:rPr>
         <w:drawing>
-          <wp:inline distT="0" distB="0" distL="0" distR="0">
+          <wp:inline distT="0" distB="0" distL="0" distR="0" wp14:anchorId="7402BC9C" wp14:editId="305322B5">
             <wp:extent cx="5943600" cy="3950335"/>
             <wp:effectExtent l="0" t="0" r="0" b="0"/>
-            <wp:docPr id="1" name="Picture 1"/>
+            <wp:docPr id="325357454" name="Picture 1"/>
             <wp:cNvGraphicFramePr>
               <a:graphicFrameLocks xmlns:a="http://schemas.openxmlformats.org/drawingml/2006/main" noChangeAspect="1"/>
             </wp:cNvGraphicFramePr>
@@ -126,13 +305,119 @@
               <a:graphicData uri="http://schemas.openxmlformats.org/drawingml/2006/picture">
                 <pic:pic xmlns:pic="http://schemas.openxmlformats.org/drawingml/2006/picture">
                   <pic:nvPicPr>
-                    <pic:cNvPr id="1" name="Picture 1"/>
+                    <pic:cNvPr id="325357454" name=""/>
+                    <pic:cNvPicPr/>
+                  </pic:nvPicPr>
+                  <pic:blipFill>
+                    <a:blip r:embed="rId5"/>
+                    <a:stretch>
+                      <a:fillRect/>
+                    </a:stretch>
+                  </pic:blipFill>
+                  <pic:spPr>
+                    <a:xfrm>
+                      <a:off x="0" y="0"/>
+                      <a:ext cx="5943600" cy="3950335"/>
+                    </a:xfrm>
+                    <a:prstGeom prst="rect">
+                      <a:avLst/>
+                    </a:prstGeom>
+                  </pic:spPr>
+                </pic:pic>
+              </a:graphicData>
+            </a:graphic>
+          </wp:inline>
+        </w:drawing>
+      </w:r>
+    </w:p>
+    <w:p/>
+    <w:p>
+      <w:r>
+        <w:lastRenderedPageBreak/>
+        <w:t xml:space="preserve">The next diagrams show a view of the </w:t>
+      </w:r>
+      <w:r>
+        <w:t>objective</w:t>
+      </w:r>
+      <w:r>
+        <w:t xml:space="preserve">’s FOV </w:t>
+      </w:r>
+      <w:r>
+        <w:t>from on</w:t>
+      </w:r>
+      <w:r>
+        <w:t xml:space="preserve"> </w:t>
+      </w:r>
+      <w:r>
+        <w:t>end</w:t>
+      </w:r>
+      <w:r>
+        <w:t xml:space="preserve">, indicating where the glass is truncated for the two </w:t>
+      </w:r>
+      <w:r>
+        <w:t>variants</w:t>
+      </w:r>
+      <w:r>
+        <w:t>.  Note that the “250um grind”</w:t>
+      </w:r>
+      <w:r>
+        <w:t xml:space="preserve"> variant truncates the diffraction-limited FOV.</w:t>
+      </w:r>
+    </w:p>
+    <w:p>
+      <w:pPr>
+        <w:rPr>
+          <w:b/>
+          <w:bCs/>
+        </w:rPr>
+      </w:pPr>
+      <w:r>
+        <w:rPr>
+          <w:b/>
+          <w:bCs/>
+        </w:rPr>
+        <w:t xml:space="preserve"> </w:t>
+      </w:r>
+    </w:p>
+    <w:p>
+      <w:pPr>
+        <w:rPr>
+          <w:b/>
+          <w:bCs/>
+        </w:rPr>
+      </w:pPr>
+      <w:r>
+        <w:rPr>
+          <w:b/>
+          <w:bCs/>
+          <w:noProof/>
+        </w:rPr>
+        <w:drawing>
+          <wp:inline distT="0" distB="0" distL="0" distR="0" wp14:anchorId="34A59338" wp14:editId="48D8C955">
+            <wp:extent cx="4389120" cy="2651760"/>
+            <wp:effectExtent l="0" t="0" r="0" b="0"/>
+            <wp:docPr id="114831911" name="Picture 6"/>
+            <wp:cNvGraphicFramePr>
+              <a:graphicFrameLocks xmlns:a="http://schemas.openxmlformats.org/drawingml/2006/main" noChangeAspect="1"/>
+            </wp:cNvGraphicFramePr>
+            <a:graphic xmlns:a="http://schemas.openxmlformats.org/drawingml/2006/main">
+              <a:graphicData uri="http://schemas.openxmlformats.org/drawingml/2006/picture">
+                <pic:pic xmlns:pic="http://schemas.openxmlformats.org/drawingml/2006/picture">
+                  <pic:nvPicPr>
+                    <pic:cNvPr id="0" name="Picture 7"/>
                     <pic:cNvPicPr>
                       <a:picLocks noChangeAspect="1" noChangeArrowheads="1"/>
                     </pic:cNvPicPr>
                   </pic:nvPicPr>
-                  <pic:blipFill>
-                    <a:blip r:embed="rId2"/>
+                  <pic:blipFill rotWithShape="1">
+                    <a:blip r:embed="rId6">
+                      <a:extLst>
+                        <a:ext uri="{28A0092B-C50C-407E-A947-70E740481C1C}">
+                          <a14:useLocalDpi xmlns:a14="http://schemas.microsoft.com/office/drawing/2010/main" val="0"/>
+                        </a:ext>
+                      </a:extLst>
+                    </a:blip>
+                    <a:srcRect b="29114"/>
                     <a:stretch>
                       <a:fillRect/>
                     </a:stretch>
@@ -140,7 +425,91 @@
                   <pic:spPr bwMode="auto">
                     <a:xfrm>
                       <a:off x="0" y="0"/>
-                      <a:ext cx="5943600" cy="3950335"/>
+                      <a:ext cx="4389120" cy="2651760"/>
+                    </a:xfrm>
+                    <a:prstGeom prst="rect">
+                      <a:avLst/>
+                    </a:prstGeom>
+                    <a:noFill/>
+                    <a:ln>
+                      <a:noFill/>
+                    </a:ln>
+                    <a:extLst>
+                      <a:ext uri="{53640926-AAD7-44D8-BBD7-CCE9431645EC}">
+                        <a14:shadowObscured xmlns:a14="http://schemas.microsoft.com/office/drawing/2010/main"/>
+                      </a:ext>
+                    </a:extLst>
+                  </pic:spPr>
+                </pic:pic>
+              </a:graphicData>
+            </a:graphic>
+          </wp:inline>
+        </w:drawing>
+      </w:r>
+    </w:p>
+    <w:p>
+      <w:pPr>
+        <w:rPr>
+          <w:b/>
+          <w:bCs/>
+        </w:rPr>
+      </w:pPr>
+    </w:p>
+    <w:p>
+      <w:pPr>
+        <w:rPr>
+          <w:b/>
+          <w:bCs/>
+        </w:rPr>
+      </w:pPr>
+    </w:p>
+    <w:p>
+      <w:pPr>
+        <w:rPr>
+          <w:b/>
+          <w:bCs/>
+        </w:rPr>
+      </w:pPr>
+      <w:r>
+        <w:rPr>
+          <w:b/>
+          <w:bCs/>
+          <w:noProof/>
+        </w:rPr>
+        <w:drawing>
+          <wp:inline distT="0" distB="0" distL="0" distR="0" wp14:anchorId="4C7431C4" wp14:editId="6056C79C">
+            <wp:extent cx="4379976" cy="3913632"/>
+            <wp:effectExtent l="0" t="0" r="1905" b="0"/>
+            <wp:docPr id="56842894" name="Picture 9"/>
+            <wp:cNvGraphicFramePr>
+              <a:graphicFrameLocks xmlns:a="http://schemas.openxmlformats.org/drawingml/2006/main" noChangeAspect="1"/>
+            </wp:cNvGraphicFramePr>
+            <a:graphic xmlns:a="http://schemas.openxmlformats.org/drawingml/2006/main">
+              <a:graphicData uri="http://schemas.openxmlformats.org/drawingml/2006/picture">
+                <pic:pic xmlns:pic="http://schemas.openxmlformats.org/drawingml/2006/picture">
+                  <pic:nvPicPr>
+                    <pic:cNvPr id="0" name="Picture 10"/>
+                    <pic:cNvPicPr>
+                      <a:picLocks noChangeAspect="1" noChangeArrowheads="1"/>
+                    </pic:cNvPicPr>
+                  </pic:nvPicPr>
+                  <pic:blipFill>
+                    <a:blip r:embed="rId7">
+                      <a:extLst>
+                        <a:ext uri="{28A0092B-C50C-407E-A947-70E740481C1C}">
+                          <a14:useLocalDpi xmlns:a14="http://schemas.microsoft.com/office/drawing/2010/main" val="0"/>
+                        </a:ext>
+                      </a:extLst>
+                    </a:blip>
+                    <a:srcRect/>
+                    <a:stretch>
+                      <a:fillRect/>
+                    </a:stretch>
+                  </pic:blipFill>
+                  <pic:spPr bwMode="auto">
+                    <a:xfrm>
+                      <a:off x="0" y="0"/>
+                      <a:ext cx="4379976" cy="3913632"/>
                     </a:xfrm>
                     <a:prstGeom prst="rect">
                       <a:avLst/>
@@ -153,33 +522,332 @@
           </wp:inline>
         </w:drawing>
       </w:r>
-      <w:r>
-        <w:rPr>
-          <w:b/>
-          <w:bCs/>
-        </w:rPr>
-        <w:t xml:space="preserve"> </w:t>
-      </w:r>
     </w:p>
     <w:sectPr>
-      <w:type w:val="nextPage"/>
       <w:pgSz w:w="12240" w:h="15840"/>
-      <w:pgMar w:left="1440" w:right="1440" w:gutter="0" w:header="0" w:top="1440" w:footer="0" w:bottom="1440"/>
-      <w:pgNumType w:fmt="decimal"/>
-      <w:formProt w:val="false"/>
-      <w:textDirection w:val="lrTb"/>
-      <w:docGrid w:type="default" w:linePitch="360" w:charSpace="0"/>
+      <w:pgMar w:top="1440" w:right="1440" w:bottom="1440" w:left="1440" w:header="720" w:footer="720" w:gutter="0"/>
+      <w:cols w:space="720"/>
+      <w:docGrid w:linePitch="360"/>
     </w:sectPr>
   </w:body>
 </w:document>
 </file>
 
+<file path=word/numbering.xml><?xml version="1.0" encoding="utf-8"?>
+<w:numbering xmlns:wpc="http://schemas.microsoft.com/office/word/2010/wordprocessingCanvas" xmlns:cx="http://schemas.microsoft.com/office/drawing/2014/chartex" xmlns:cx1="http://schemas.microsoft.com/office/drawing/2015/9/8/chartex" xmlns:cx2="http://schemas.microsoft.com/office/drawing/2015/10/21/chartex" xmlns:cx3="http://schemas.microsoft.com/office/drawing/2016/5/9/chartex" xmlns:cx4="http://schemas.microsoft.com/office/drawing/2016/5/10/chartex" xmlns:cx5="http://schemas.microsoft.com/office/drawing/2016/5/11/chartex" xmlns:cx6="http://schemas.microsoft.com/office/drawing/2016/5/12/chartex" xmlns:cx7="http://schemas.microsoft.com/office/drawing/2016/5/13/chartex" xmlns:cx8="http://schemas.microsoft.com/office/drawing/2016/5/14/chartex" xmlns:mc="http://schemas.openxmlformats.org/markup-compatibility/2006" xmlns:aink="http://schemas.microsoft.com/office/drawing/2016/ink" xmlns:am3d="http://schemas.microsoft.com/office/drawing/2017/model3d" xmlns:o="urn:schemas-microsoft-com:office:office" xmlns:oel="http://schemas.microsoft.com/office/2019/extlst" xmlns:r="http://schemas.openxmlformats.org/officeDocument/2006/relationships" xmlns:m="http://schemas.openxmlformats.org/officeDocument/2006/math" xmlns:v="urn:schemas-microsoft-com:vml" xmlns:wp14="http://schemas.microsoft.com/office/word/2010/wordprocessingDrawing" xmlns:wp="http://schemas.openxmlformats.org/drawingml/2006/wordprocessingDrawing" xmlns:w10="urn:schemas-microsoft-com:office:word" xmlns:w="http://schemas.openxmlformats.org/wordprocessingml/2006/main" xmlns:w14="http://schemas.microsoft.com/office/word/2010/wordml" xmlns:w15="http://schemas.microsoft.com/office/word/2012/wordml" xmlns:w16cex="http://schemas.microsoft.com/office/word/2018/wordml/cex" xmlns:w16cid="http://schemas.microsoft.com/office/word/2016/wordml/cid" xmlns:w16="http://schemas.microsoft.com/office/word/2018/wordml" xmlns:w16du="http://schemas.microsoft.com/office/word/2023/wordml/word16du" xmlns:w16sdtdh="http://schemas.microsoft.com/office/word/2020/wordml/sdtdatahash" xmlns:w16sdtfl="http://schemas.microsoft.com/office/word/2024/wordml/sdtformatlock" xmlns:w16se="http://schemas.microsoft.com/office/word/2015/wordml/symex" xmlns:wpg="http://schemas.microsoft.com/office/word/2010/wordprocessingGroup" xmlns:wpi="http://schemas.microsoft.com/office/word/2010/wordprocessingInk" xmlns:wne="http://schemas.microsoft.com/office/word/2006/wordml" xmlns:wps="http://schemas.microsoft.com/office/word/2010/wordprocessingShape" mc:Ignorable="w14 w15 w16se w16cid w16 w16cex w16sdtdh w16sdtfl w16du wp14">
+  <w:abstractNum w:abstractNumId="0" w15:restartNumberingAfterBreak="0">
+    <w:nsid w:val="0DF35F8D"/>
+    <w:multiLevelType w:val="multilevel"/>
+    <w:tmpl w:val="BB58B742"/>
+    <w:lvl w:ilvl="0">
+      <w:start w:val="1"/>
+      <w:numFmt w:val="bullet"/>
+      <w:lvlText w:val=""/>
+      <w:lvlJc w:val="left"/>
+      <w:pPr>
+        <w:tabs>
+          <w:tab w:val="num" w:pos="720"/>
+        </w:tabs>
+        <w:ind w:left="720" w:hanging="360"/>
+      </w:pPr>
+      <w:rPr>
+        <w:rFonts w:ascii="Symbol" w:hAnsi="Symbol" w:hint="default"/>
+        <w:sz w:val="20"/>
+      </w:rPr>
+    </w:lvl>
+    <w:lvl w:ilvl="1" w:tentative="1">
+      <w:start w:val="1"/>
+      <w:numFmt w:val="bullet"/>
+      <w:lvlText w:val="o"/>
+      <w:lvlJc w:val="left"/>
+      <w:pPr>
+        <w:tabs>
+          <w:tab w:val="num" w:pos="1440"/>
+        </w:tabs>
+        <w:ind w:left="1440" w:hanging="360"/>
+      </w:pPr>
+      <w:rPr>
+        <w:rFonts w:ascii="Courier New" w:hAnsi="Courier New" w:hint="default"/>
+        <w:sz w:val="20"/>
+      </w:rPr>
+    </w:lvl>
+    <w:lvl w:ilvl="2" w:tentative="1">
+      <w:start w:val="1"/>
+      <w:numFmt w:val="bullet"/>
+      <w:lvlText w:val=""/>
+      <w:lvlJc w:val="left"/>
+      <w:pPr>
+        <w:tabs>
+          <w:tab w:val="num" w:pos="2160"/>
+        </w:tabs>
+        <w:ind w:left="2160" w:hanging="360"/>
+      </w:pPr>
+      <w:rPr>
+        <w:rFonts w:ascii="Wingdings" w:hAnsi="Wingdings" w:hint="default"/>
+        <w:sz w:val="20"/>
+      </w:rPr>
+    </w:lvl>
+    <w:lvl w:ilvl="3" w:tentative="1">
+      <w:start w:val="1"/>
+      <w:numFmt w:val="bullet"/>
+      <w:lvlText w:val=""/>
+      <w:lvlJc w:val="left"/>
+      <w:pPr>
+        <w:tabs>
+          <w:tab w:val="num" w:pos="2880"/>
+        </w:tabs>
+        <w:ind w:left="2880" w:hanging="360"/>
+      </w:pPr>
+      <w:rPr>
+        <w:rFonts w:ascii="Wingdings" w:hAnsi="Wingdings" w:hint="default"/>
+        <w:sz w:val="20"/>
+      </w:rPr>
+    </w:lvl>
+    <w:lvl w:ilvl="4" w:tentative="1">
+      <w:start w:val="1"/>
+      <w:numFmt w:val="bullet"/>
+      <w:lvlText w:val=""/>
+      <w:lvlJc w:val="left"/>
+      <w:pPr>
+        <w:tabs>
+          <w:tab w:val="num" w:pos="3600"/>
+        </w:tabs>
+        <w:ind w:left="3600" w:hanging="360"/>
+      </w:pPr>
+      <w:rPr>
+        <w:rFonts w:ascii="Wingdings" w:hAnsi="Wingdings" w:hint="default"/>
+        <w:sz w:val="20"/>
+      </w:rPr>
+    </w:lvl>
+    <w:lvl w:ilvl="5" w:tentative="1">
+      <w:start w:val="1"/>
+      <w:numFmt w:val="bullet"/>
+      <w:lvlText w:val=""/>
+      <w:lvlJc w:val="left"/>
+      <w:pPr>
+        <w:tabs>
+          <w:tab w:val="num" w:pos="4320"/>
+        </w:tabs>
+        <w:ind w:left="4320" w:hanging="360"/>
+      </w:pPr>
+      <w:rPr>
+        <w:rFonts w:ascii="Wingdings" w:hAnsi="Wingdings" w:hint="default"/>
+        <w:sz w:val="20"/>
+      </w:rPr>
+    </w:lvl>
+    <w:lvl w:ilvl="6" w:tentative="1">
+      <w:start w:val="1"/>
+      <w:numFmt w:val="bullet"/>
+      <w:lvlText w:val=""/>
+      <w:lvlJc w:val="left"/>
+      <w:pPr>
+        <w:tabs>
+          <w:tab w:val="num" w:pos="5040"/>
+        </w:tabs>
+        <w:ind w:left="5040" w:hanging="360"/>
+      </w:pPr>
+      <w:rPr>
+        <w:rFonts w:ascii="Wingdings" w:hAnsi="Wingdings" w:hint="default"/>
+        <w:sz w:val="20"/>
+      </w:rPr>
+    </w:lvl>
+    <w:lvl w:ilvl="7" w:tentative="1">
+      <w:start w:val="1"/>
+      <w:numFmt w:val="bullet"/>
+      <w:lvlText w:val=""/>
+      <w:lvlJc w:val="left"/>
+      <w:pPr>
+        <w:tabs>
+          <w:tab w:val="num" w:pos="5760"/>
+        </w:tabs>
+        <w:ind w:left="5760" w:hanging="360"/>
+      </w:pPr>
+      <w:rPr>
+        <w:rFonts w:ascii="Wingdings" w:hAnsi="Wingdings" w:hint="default"/>
+        <w:sz w:val="20"/>
+      </w:rPr>
+    </w:lvl>
+    <w:lvl w:ilvl="8" w:tentative="1">
+      <w:start w:val="1"/>
+      <w:numFmt w:val="bullet"/>
+      <w:lvlText w:val=""/>
+      <w:lvlJc w:val="left"/>
+      <w:pPr>
+        <w:tabs>
+          <w:tab w:val="num" w:pos="6480"/>
+        </w:tabs>
+        <w:ind w:left="6480" w:hanging="360"/>
+      </w:pPr>
+      <w:rPr>
+        <w:rFonts w:ascii="Wingdings" w:hAnsi="Wingdings" w:hint="default"/>
+        <w:sz w:val="20"/>
+      </w:rPr>
+    </w:lvl>
+  </w:abstractNum>
+  <w:abstractNum w:abstractNumId="1" w15:restartNumberingAfterBreak="0">
+    <w:nsid w:val="3EF15563"/>
+    <w:multiLevelType w:val="multilevel"/>
+    <w:tmpl w:val="ECF03566"/>
+    <w:lvl w:ilvl="0">
+      <w:start w:val="1"/>
+      <w:numFmt w:val="bullet"/>
+      <w:lvlText w:val=""/>
+      <w:lvlJc w:val="left"/>
+      <w:pPr>
+        <w:tabs>
+          <w:tab w:val="num" w:pos="720"/>
+        </w:tabs>
+        <w:ind w:left="720" w:hanging="360"/>
+      </w:pPr>
+      <w:rPr>
+        <w:rFonts w:ascii="Symbol" w:hAnsi="Symbol" w:hint="default"/>
+        <w:sz w:val="20"/>
+      </w:rPr>
+    </w:lvl>
+    <w:lvl w:ilvl="1" w:tentative="1">
+      <w:start w:val="1"/>
+      <w:numFmt w:val="bullet"/>
+      <w:lvlText w:val="o"/>
+      <w:lvlJc w:val="left"/>
+      <w:pPr>
+        <w:tabs>
+          <w:tab w:val="num" w:pos="1440"/>
+        </w:tabs>
+        <w:ind w:left="1440" w:hanging="360"/>
+      </w:pPr>
+      <w:rPr>
+        <w:rFonts w:ascii="Courier New" w:hAnsi="Courier New" w:hint="default"/>
+        <w:sz w:val="20"/>
+      </w:rPr>
+    </w:lvl>
+    <w:lvl w:ilvl="2" w:tentative="1">
+      <w:start w:val="1"/>
+      <w:numFmt w:val="bullet"/>
+      <w:lvlText w:val=""/>
+      <w:lvlJc w:val="left"/>
+      <w:pPr>
+        <w:tabs>
+          <w:tab w:val="num" w:pos="2160"/>
+        </w:tabs>
+        <w:ind w:left="2160" w:hanging="360"/>
+      </w:pPr>
+      <w:rPr>
+        <w:rFonts w:ascii="Wingdings" w:hAnsi="Wingdings" w:hint="default"/>
+        <w:sz w:val="20"/>
+      </w:rPr>
+    </w:lvl>
+    <w:lvl w:ilvl="3" w:tentative="1">
+      <w:start w:val="1"/>
+      <w:numFmt w:val="bullet"/>
+      <w:lvlText w:val=""/>
+      <w:lvlJc w:val="left"/>
+      <w:pPr>
+        <w:tabs>
+          <w:tab w:val="num" w:pos="2880"/>
+        </w:tabs>
+        <w:ind w:left="2880" w:hanging="360"/>
+      </w:pPr>
+      <w:rPr>
+        <w:rFonts w:ascii="Wingdings" w:hAnsi="Wingdings" w:hint="default"/>
+        <w:sz w:val="20"/>
+      </w:rPr>
+    </w:lvl>
+    <w:lvl w:ilvl="4" w:tentative="1">
+      <w:start w:val="1"/>
+      <w:numFmt w:val="bullet"/>
+      <w:lvlText w:val=""/>
+      <w:lvlJc w:val="left"/>
+      <w:pPr>
+        <w:tabs>
+          <w:tab w:val="num" w:pos="3600"/>
+        </w:tabs>
+        <w:ind w:left="3600" w:hanging="360"/>
+      </w:pPr>
+      <w:rPr>
+        <w:rFonts w:ascii="Wingdings" w:hAnsi="Wingdings" w:hint="default"/>
+        <w:sz w:val="20"/>
+      </w:rPr>
+    </w:lvl>
+    <w:lvl w:ilvl="5" w:tentative="1">
+      <w:start w:val="1"/>
+      <w:numFmt w:val="bullet"/>
+      <w:lvlText w:val=""/>
+      <w:lvlJc w:val="left"/>
+      <w:pPr>
+        <w:tabs>
+          <w:tab w:val="num" w:pos="4320"/>
+        </w:tabs>
+        <w:ind w:left="4320" w:hanging="360"/>
+      </w:pPr>
+      <w:rPr>
+        <w:rFonts w:ascii="Wingdings" w:hAnsi="Wingdings" w:hint="default"/>
+        <w:sz w:val="20"/>
+      </w:rPr>
+    </w:lvl>
+    <w:lvl w:ilvl="6" w:tentative="1">
+      <w:start w:val="1"/>
+      <w:numFmt w:val="bullet"/>
+      <w:lvlText w:val=""/>
+      <w:lvlJc w:val="left"/>
+      <w:pPr>
+        <w:tabs>
+          <w:tab w:val="num" w:pos="5040"/>
+        </w:tabs>
+        <w:ind w:left="5040" w:hanging="360"/>
+      </w:pPr>
+      <w:rPr>
+        <w:rFonts w:ascii="Wingdings" w:hAnsi="Wingdings" w:hint="default"/>
+        <w:sz w:val="20"/>
+      </w:rPr>
+    </w:lvl>
+    <w:lvl w:ilvl="7" w:tentative="1">
+      <w:start w:val="1"/>
+      <w:numFmt w:val="bullet"/>
+      <w:lvlText w:val=""/>
+      <w:lvlJc w:val="left"/>
+      <w:pPr>
+        <w:tabs>
+          <w:tab w:val="num" w:pos="5760"/>
+        </w:tabs>
+        <w:ind w:left="5760" w:hanging="360"/>
+      </w:pPr>
+      <w:rPr>
+        <w:rFonts w:ascii="Wingdings" w:hAnsi="Wingdings" w:hint="default"/>
+        <w:sz w:val="20"/>
+      </w:rPr>
+    </w:lvl>
+    <w:lvl w:ilvl="8" w:tentative="1">
+      <w:start w:val="1"/>
+      <w:numFmt w:val="bullet"/>
+      <w:lvlText w:val=""/>
+      <w:lvlJc w:val="left"/>
+      <w:pPr>
+        <w:tabs>
+          <w:tab w:val="num" w:pos="6480"/>
+        </w:tabs>
+        <w:ind w:left="6480" w:hanging="360"/>
+      </w:pPr>
+      <w:rPr>
+        <w:rFonts w:ascii="Wingdings" w:hAnsi="Wingdings" w:hint="default"/>
+        <w:sz w:val="20"/>
+      </w:rPr>
+    </w:lvl>
+  </w:abstractNum>
+  <w:num w:numId="1" w16cid:durableId="1796867260">
+    <w:abstractNumId w:val="1"/>
+  </w:num>
+  <w:num w:numId="2" w16cid:durableId="41709644">
+    <w:abstractNumId w:val="0"/>
+  </w:num>
+</w:numbering>
+</file>
+
 <file path=word/styles.xml><?xml version="1.0" encoding="utf-8"?>
-<w:styles xmlns:w="http://schemas.openxmlformats.org/wordprocessingml/2006/main" xmlns:w14="http://schemas.microsoft.com/office/word/2010/wordml" xmlns:mc="http://schemas.openxmlformats.org/markup-compatibility/2006" mc:Ignorable="w14">
+<w:styles xmlns:mc="http://schemas.openxmlformats.org/markup-compatibility/2006" xmlns:r="http://schemas.openxmlformats.org/officeDocument/2006/relationships" xmlns:w="http://schemas.openxmlformats.org/wordprocessingml/2006/main" xmlns:w14="http://schemas.microsoft.com/office/word/2010/wordml" xmlns:w15="http://schemas.microsoft.com/office/word/2012/wordml" xmlns:w16cex="http://schemas.microsoft.com/office/word/2018/wordml/cex" xmlns:w16cid="http://schemas.microsoft.com/office/word/2016/wordml/cid" xmlns:w16="http://schemas.microsoft.com/office/word/2018/wordml" xmlns:w16du="http://schemas.microsoft.com/office/word/2023/wordml/word16du" xmlns:w16sdtdh="http://schemas.microsoft.com/office/word/2020/wordml/sdtdatahash" xmlns:w16sdtfl="http://schemas.microsoft.com/office/word/2024/wordml/sdtformatlock" xmlns:w16se="http://schemas.microsoft.com/office/word/2015/wordml/symex" mc:Ignorable="w14 w15 w16se w16cid w16 w16cex w16sdtdh w16sdtfl w16du">
   <w:docDefaults>
     <w:rPrDefault>
       <w:rPr>
-        <w:rFonts w:ascii="Calibri" w:hAnsi="Calibri" w:eastAsia="Calibri" w:cs="" w:asciiTheme="minorHAnsi" w:cstheme="minorBidi" w:eastAsiaTheme="minorHAnsi" w:hAnsiTheme="minorHAnsi"/>
+        <w:rFonts w:asciiTheme="minorHAnsi" w:eastAsiaTheme="minorHAnsi" w:hAnsiTheme="minorHAnsi" w:cstheme="minorBidi"/>
         <w:sz w:val="22"/>
         <w:szCs w:val="22"/>
         <w:lang w:val="en-US" w:eastAsia="en-US" w:bidi="ar-SA"/>
@@ -187,21 +855,21 @@
     </w:rPrDefault>
     <w:pPrDefault>
       <w:pPr>
-        <w:suppressAutoHyphens w:val="true"/>
+        <w:spacing w:after="160" w:line="259" w:lineRule="auto"/>
       </w:pPr>
     </w:pPrDefault>
   </w:docDefaults>
   <w:latentStyles w:defLockedState="0" w:defUIPriority="99" w:defSemiHidden="0" w:defUnhideWhenUsed="0" w:defQFormat="0" w:count="376">
     <w:lsdException w:name="Normal" w:uiPriority="0" w:qFormat="1"/>
     <w:lsdException w:name="heading 1" w:uiPriority="9" w:qFormat="1"/>
-    <w:lsdException w:name="heading 2" w:uiPriority="9" w:semiHidden="1" w:unhideWhenUsed="1" w:qFormat="1"/>
-    <w:lsdException w:name="heading 3" w:uiPriority="9" w:semiHidden="1" w:unhideWhenUsed="1" w:qFormat="1"/>
-    <w:lsdException w:name="heading 4" w:uiPriority="9" w:semiHidden="1" w:unhideWhenUsed="1" w:qFormat="1"/>
-    <w:lsdException w:name="heading 5" w:uiPriority="9" w:semiHidden="1" w:unhideWhenUsed="1" w:qFormat="1"/>
-    <w:lsdException w:name="heading 6" w:uiPriority="9" w:semiHidden="1" w:unhideWhenUsed="1" w:qFormat="1"/>
-    <w:lsdException w:name="heading 7" w:uiPriority="9" w:semiHidden="1" w:unhideWhenUsed="1" w:qFormat="1"/>
-    <w:lsdException w:name="heading 8" w:uiPriority="9" w:semiHidden="1" w:unhideWhenUsed="1" w:qFormat="1"/>
-    <w:lsdException w:name="heading 9" w:uiPriority="9" w:semiHidden="1" w:unhideWhenUsed="1" w:qFormat="1"/>
+    <w:lsdException w:name="heading 2" w:semiHidden="1" w:uiPriority="9" w:unhideWhenUsed="1" w:qFormat="1"/>
+    <w:lsdException w:name="heading 3" w:semiHidden="1" w:uiPriority="9" w:unhideWhenUsed="1" w:qFormat="1"/>
+    <w:lsdException w:name="heading 4" w:semiHidden="1" w:uiPriority="9" w:unhideWhenUsed="1" w:qFormat="1"/>
+    <w:lsdException w:name="heading 5" w:semiHidden="1" w:uiPriority="9" w:unhideWhenUsed="1" w:qFormat="1"/>
+    <w:lsdException w:name="heading 6" w:semiHidden="1" w:uiPriority="9" w:unhideWhenUsed="1" w:qFormat="1"/>
+    <w:lsdException w:name="heading 7" w:semiHidden="1" w:uiPriority="9" w:unhideWhenUsed="1" w:qFormat="1"/>
+    <w:lsdException w:name="heading 8" w:semiHidden="1" w:uiPriority="9" w:unhideWhenUsed="1" w:qFormat="1"/>
+    <w:lsdException w:name="heading 9" w:semiHidden="1" w:uiPriority="9" w:unhideWhenUsed="1" w:qFormat="1"/>
     <w:lsdException w:name="index 1" w:semiHidden="1" w:unhideWhenUsed="1"/>
     <w:lsdException w:name="index 2" w:semiHidden="1" w:unhideWhenUsed="1"/>
     <w:lsdException w:name="index 3" w:semiHidden="1" w:unhideWhenUsed="1"/>
@@ -211,22 +879,22 @@
     <w:lsdException w:name="index 7" w:semiHidden="1" w:unhideWhenUsed="1"/>
     <w:lsdException w:name="index 8" w:semiHidden="1" w:unhideWhenUsed="1"/>
     <w:lsdException w:name="index 9" w:semiHidden="1" w:unhideWhenUsed="1"/>
-    <w:lsdException w:name="toc 1" w:uiPriority="39" w:semiHidden="1" w:unhideWhenUsed="1"/>
-    <w:lsdException w:name="toc 2" w:uiPriority="39" w:semiHidden="1" w:unhideWhenUsed="1"/>
-    <w:lsdException w:name="toc 3" w:uiPriority="39" w:semiHidden="1" w:unhideWhenUsed="1"/>
-    <w:lsdException w:name="toc 4" w:uiPriority="39" w:semiHidden="1" w:unhideWhenUsed="1"/>
-    <w:lsdException w:name="toc 5" w:uiPriority="39" w:semiHidden="1" w:unhideWhenUsed="1"/>
-    <w:lsdException w:name="toc 6" w:uiPriority="39" w:semiHidden="1" w:unhideWhenUsed="1"/>
-    <w:lsdException w:name="toc 7" w:uiPriority="39" w:semiHidden="1" w:unhideWhenUsed="1"/>
-    <w:lsdException w:name="toc 8" w:uiPriority="39" w:semiHidden="1" w:unhideWhenUsed="1"/>
-    <w:lsdException w:name="toc 9" w:uiPriority="39" w:semiHidden="1" w:unhideWhenUsed="1"/>
+    <w:lsdException w:name="toc 1" w:semiHidden="1" w:uiPriority="39" w:unhideWhenUsed="1"/>
+    <w:lsdException w:name="toc 2" w:semiHidden="1" w:uiPriority="39" w:unhideWhenUsed="1"/>
+    <w:lsdException w:name="toc 3" w:semiHidden="1" w:uiPriority="39" w:unhideWhenUsed="1"/>
+    <w:lsdException w:name="toc 4" w:semiHidden="1" w:uiPriority="39" w:unhideWhenUsed="1"/>
+    <w:lsdException w:name="toc 5" w:semiHidden="1" w:uiPriority="39" w:unhideWhenUsed="1"/>
+    <w:lsdException w:name="toc 6" w:semiHidden="1" w:uiPriority="39" w:unhideWhenUsed="1"/>
+    <w:lsdException w:name="toc 7" w:semiHidden="1" w:uiPriority="39" w:unhideWhenUsed="1"/>
+    <w:lsdException w:name="toc 8" w:semiHidden="1" w:uiPriority="39" w:unhideWhenUsed="1"/>
+    <w:lsdException w:name="toc 9" w:semiHidden="1" w:uiPriority="39" w:unhideWhenUsed="1"/>
     <w:lsdException w:name="Normal Indent" w:semiHidden="1" w:unhideWhenUsed="1"/>
     <w:lsdException w:name="footnote text" w:semiHidden="1" w:unhideWhenUsed="1"/>
     <w:lsdException w:name="annotation text" w:semiHidden="1" w:unhideWhenUsed="1"/>
     <w:lsdException w:name="header" w:semiHidden="1" w:unhideWhenUsed="1"/>
     <w:lsdException w:name="footer" w:semiHidden="1" w:unhideWhenUsed="1"/>
     <w:lsdException w:name="index heading" w:semiHidden="1" w:unhideWhenUsed="1"/>
-    <w:lsdException w:name="caption" w:uiPriority="35" w:semiHidden="1" w:unhideWhenUsed="1" w:qFormat="1"/>
+    <w:lsdException w:name="caption" w:semiHidden="1" w:uiPriority="35" w:unhideWhenUsed="1" w:qFormat="1"/>
     <w:lsdException w:name="table of figures" w:semiHidden="1" w:unhideWhenUsed="1"/>
     <w:lsdException w:name="envelope address" w:semiHidden="1" w:unhideWhenUsed="1"/>
     <w:lsdException w:name="envelope return" w:semiHidden="1" w:unhideWhenUsed="1"/>
@@ -257,7 +925,7 @@
     <w:lsdException w:name="Title" w:uiPriority="10" w:qFormat="1"/>
     <w:lsdException w:name="Closing" w:semiHidden="1" w:unhideWhenUsed="1"/>
     <w:lsdException w:name="Signature" w:semiHidden="1" w:unhideWhenUsed="1"/>
-    <w:lsdException w:name="Default Paragraph Font" w:uiPriority="1" w:semiHidden="1" w:unhideWhenUsed="1"/>
+    <w:lsdException w:name="Default Paragraph Font" w:semiHidden="1" w:uiPriority="1" w:unhideWhenUsed="1"/>
     <w:lsdException w:name="Body Text" w:semiHidden="1" w:unhideWhenUsed="1"/>
     <w:lsdException w:name="Body Text Indent" w:semiHidden="1" w:unhideWhenUsed="1"/>
     <w:lsdException w:name="List Continue" w:semiHidden="1" w:unhideWhenUsed="1"/>
@@ -457,8 +1125,8 @@
     <w:lsdException w:name="Subtle Reference" w:uiPriority="31" w:qFormat="1"/>
     <w:lsdException w:name="Intense Reference" w:uiPriority="32" w:qFormat="1"/>
     <w:lsdException w:name="Book Title" w:uiPriority="33" w:qFormat="1"/>
-    <w:lsdException w:name="Bibliography" w:uiPriority="37" w:semiHidden="1" w:unhideWhenUsed="1"/>
-    <w:lsdException w:name="TOC Heading" w:uiPriority="39" w:semiHidden="1" w:unhideWhenUsed="1" w:qFormat="1"/>
+    <w:lsdException w:name="Bibliography" w:semiHidden="1" w:uiPriority="37" w:unhideWhenUsed="1"/>
+    <w:lsdException w:name="TOC Heading" w:semiHidden="1" w:uiPriority="39" w:unhideWhenUsed="1" w:qFormat="1"/>
     <w:lsdException w:name="Plain Table 1" w:uiPriority="41"/>
     <w:lsdException w:name="Plain Table 2" w:uiPriority="42"/>
     <w:lsdException w:name="Plain Table 3" w:uiPriority="43"/>
@@ -569,96 +1237,14 @@
     <w:lsdException w:name="Unresolved Mention" w:semiHidden="1" w:unhideWhenUsed="1"/>
     <w:lsdException w:name="Smart Link" w:semiHidden="1" w:unhideWhenUsed="1"/>
   </w:latentStyles>
-  <w:style w:type="paragraph" w:styleId="Normal" w:default="1">
+  <w:style w:type="paragraph" w:default="1" w:styleId="Normal">
     <w:name w:val="Normal"/>
     <w:qFormat/>
-    <w:pPr>
-      <w:widowControl/>
-      <w:bidi w:val="0"/>
-      <w:spacing w:lineRule="auto" w:line="259" w:before="0" w:after="160"/>
-      <w:jc w:val="start"/>
-    </w:pPr>
-    <w:rPr>
-      <w:rFonts w:ascii="Calibri" w:hAnsi="Calibri" w:eastAsia="Calibri" w:cs="" w:asciiTheme="minorHAnsi" w:cstheme="minorBidi" w:eastAsiaTheme="minorHAnsi" w:hAnsiTheme="minorHAnsi"/>
-      <w:color w:val="auto"/>
-      <w:kern w:val="0"/>
-      <w:sz w:val="22"/>
-      <w:szCs w:val="22"/>
-      <w:lang w:val="en-US" w:eastAsia="en-US" w:bidi="ar-SA"/>
-    </w:rPr>
   </w:style>
-  <w:style w:type="character" w:styleId="DefaultParagraphFont" w:default="1">
+  <w:style w:type="character" w:default="1" w:styleId="DefaultParagraphFont">
     <w:name w:val="Default Paragraph Font"/>
     <w:uiPriority w:val="1"/>
-    <w:semiHidden/>
     <w:unhideWhenUsed/>
-    <w:qFormat/>
-    <w:rPr/>
-  </w:style>
-  <w:style w:type="paragraph" w:styleId="Heading">
-    <w:name w:val="Heading"/>
-    <w:basedOn w:val="Normal"/>
-    <w:next w:val="BodyText"/>
-    <w:qFormat/>
-    <w:pPr>
-      <w:keepNext w:val="true"/>
-      <w:spacing w:before="240" w:after="120"/>
-    </w:pPr>
-    <w:rPr>
-      <w:rFonts w:ascii="Liberation Sans" w:hAnsi="Liberation Sans" w:eastAsia="Microsoft YaHei" w:cs="Arial"/>
-      <w:sz w:val="28"/>
-      <w:szCs w:val="28"/>
-    </w:rPr>
-  </w:style>
-  <w:style w:type="paragraph" w:styleId="BodyText">
-    <w:name w:val="Body Text"/>
-    <w:basedOn w:val="Normal"/>
-    <w:pPr>
-      <w:spacing w:lineRule="auto" w:line="276" w:before="0" w:after="140"/>
-    </w:pPr>
-    <w:rPr/>
-  </w:style>
-  <w:style w:type="paragraph" w:styleId="List">
-    <w:name w:val="List"/>
-    <w:basedOn w:val="BodyText"/>
-    <w:pPr/>
-    <w:rPr>
-      <w:rFonts w:cs="Arial"/>
-    </w:rPr>
-  </w:style>
-  <w:style w:type="paragraph" w:styleId="Caption">
-    <w:name w:val="caption"/>
-    <w:basedOn w:val="Normal"/>
-    <w:qFormat/>
-    <w:pPr>
-      <w:suppressLineNumbers/>
-      <w:spacing w:before="120" w:after="120"/>
-    </w:pPr>
-    <w:rPr>
-      <w:rFonts w:cs="Arial"/>
-      <w:i/>
-      <w:iCs/>
-      <w:sz w:val="24"/>
-      <w:szCs w:val="24"/>
-    </w:rPr>
-  </w:style>
-  <w:style w:type="paragraph" w:styleId="Index">
-    <w:name w:val="Index"/>
-    <w:basedOn w:val="Normal"/>
-    <w:qFormat/>
-    <w:pPr>
-      <w:suppressLineNumbers/>
-    </w:pPr>
-    <w:rPr>
-      <w:rFonts w:cs="Arial"/>
-    </w:rPr>
-  </w:style>
-  <w:style w:type="numbering" w:styleId="NoList" w:default="1">
-    <w:name w:val="No List"/>
-    <w:uiPriority w:val="99"/>
-    <w:semiHidden/>
-    <w:unhideWhenUsed/>
-    <w:qFormat/>
   </w:style>
   <w:style w:type="table" w:default="1" w:styleId="TableNormal">
     <w:name w:val="Normal Table"/>
@@ -666,6 +1252,7 @@
     <w:semiHidden/>
     <w:unhideWhenUsed/>
     <w:tblPr>
+      <w:tblInd w:w="0" w:type="dxa"/>
       <w:tblCellMar>
         <w:top w:w="0" w:type="dxa"/>
         <w:left w:w="108" w:type="dxa"/>
@@ -674,22 +1261,28 @@
       </w:tblCellMar>
     </w:tblPr>
   </w:style>
+  <w:style w:type="numbering" w:default="1" w:styleId="NoList">
+    <w:name w:val="No List"/>
+    <w:uiPriority w:val="99"/>
+    <w:semiHidden/>
+    <w:unhideWhenUsed/>
+  </w:style>
   <w:style w:type="table" w:styleId="TableGrid">
     <w:name w:val="Table Grid"/>
     <w:basedOn w:val="TableNormal"/>
     <w:uiPriority w:val="39"/>
-    <w:rsid w:val="001509a8"/>
+    <w:rsid w:val="001509A8"/>
     <w:pPr>
       <w:spacing w:after="0" w:line="240" w:lineRule="auto"/>
     </w:pPr>
     <w:tblPr>
       <w:tblBorders>
-        <w:top w:val="single" w:color="auto" w:sz="4" w:space="0"/>
-        <w:left w:val="single" w:color="auto" w:sz="4" w:space="0"/>
-        <w:bottom w:val="single" w:color="auto" w:sz="4" w:space="0"/>
-        <w:right w:val="single" w:color="auto" w:sz="4" w:space="0"/>
-        <w:insideH w:val="single" w:color="auto" w:sz="4" w:space="0"/>
-        <w:insideV w:val="single" w:color="auto" w:sz="4" w:space="0"/>
+        <w:top w:val="single" w:sz="4" w:space="0" w:color="auto"/>
+        <w:left w:val="single" w:sz="4" w:space="0" w:color="auto"/>
+        <w:bottom w:val="single" w:sz="4" w:space="0" w:color="auto"/>
+        <w:right w:val="single" w:sz="4" w:space="0" w:color="auto"/>
+        <w:insideH w:val="single" w:sz="4" w:space="0" w:color="auto"/>
+        <w:insideV w:val="single" w:sz="4" w:space="0" w:color="auto"/>
       </w:tblBorders>
     </w:tblPr>
   </w:style>
@@ -697,97 +1290,195 @@
 </file>
 
 <file path=word/theme/theme1.xml><?xml version="1.0" encoding="utf-8"?>
-<a:theme xmlns:a="http://schemas.openxmlformats.org/drawingml/2006/main" xmlns:r="http://schemas.openxmlformats.org/officeDocument/2006/relationships" name="Office Theme">
+<a:theme xmlns:a="http://schemas.openxmlformats.org/drawingml/2006/main" name="Office Theme">
   <a:themeElements>
     <a:clrScheme name="Office">
       <a:dk1>
-        <a:srgbClr val="000000"/>
+        <a:sysClr val="windowText" lastClr="000000"/>
       </a:dk1>
       <a:lt1>
-        <a:srgbClr val="ffffff"/>
+        <a:sysClr val="window" lastClr="FFFFFF"/>
       </a:lt1>
       <a:dk2>
-        <a:srgbClr val="44546a"/>
+        <a:srgbClr val="44546A"/>
       </a:dk2>
       <a:lt2>
-        <a:srgbClr val="e7e6e6"/>
+        <a:srgbClr val="E7E6E6"/>
       </a:lt2>
       <a:accent1>
-        <a:srgbClr val="4472c4"/>
+        <a:srgbClr val="4472C4"/>
       </a:accent1>
       <a:accent2>
-        <a:srgbClr val="ed7d31"/>
+        <a:srgbClr val="ED7D31"/>
       </a:accent2>
       <a:accent3>
-        <a:srgbClr val="a5a5a5"/>
+        <a:srgbClr val="A5A5A5"/>
       </a:accent3>
       <a:accent4>
-        <a:srgbClr val="ffc000"/>
+        <a:srgbClr val="FFC000"/>
       </a:accent4>
       <a:accent5>
-        <a:srgbClr val="5b9bd5"/>
+        <a:srgbClr val="5B9BD5"/>
       </a:accent5>
       <a:accent6>
-        <a:srgbClr val="70ad47"/>
+        <a:srgbClr val="70AD47"/>
       </a:accent6>
       <a:hlink>
-        <a:srgbClr val="0563c1"/>
+        <a:srgbClr val="0563C1"/>
       </a:hlink>
       <a:folHlink>
-        <a:srgbClr val="954f72"/>
+        <a:srgbClr val="954F72"/>
       </a:folHlink>
     </a:clrScheme>
     <a:fontScheme name="Office">
       <a:majorFont>
-        <a:latin typeface="Calibri Light" panose="020F0302020204030204" pitchFamily="0" charset="1"/>
+        <a:latin typeface="Calibri Light" panose="020F0302020204030204"/>
         <a:ea typeface=""/>
         <a:cs typeface=""/>
+        <a:font script="Jpan" typeface="游ゴシック Light"/>
+        <a:font script="Hang" typeface="맑은 고딕"/>
+        <a:font script="Hans" typeface="等线 Light"/>
+        <a:font script="Hant" typeface="新細明體"/>
+        <a:font script="Arab" typeface="Times New Roman"/>
+        <a:font script="Hebr" typeface="Times New Roman"/>
+        <a:font script="Thai" typeface="Angsana New"/>
+        <a:font script="Ethi" typeface="Nyala"/>
+        <a:font script="Beng" typeface="Vrinda"/>
+        <a:font script="Gujr" typeface="Shruti"/>
+        <a:font script="Khmr" typeface="MoolBoran"/>
+        <a:font script="Knda" typeface="Tunga"/>
+        <a:font script="Guru" typeface="Raavi"/>
+        <a:font script="Cans" typeface="Euphemia"/>
+        <a:font script="Cher" typeface="Plantagenet Cherokee"/>
+        <a:font script="Yiii" typeface="Microsoft Yi Baiti"/>
+        <a:font script="Tibt" typeface="Microsoft Himalaya"/>
+        <a:font script="Thaa" typeface="MV Boli"/>
+        <a:font script="Deva" typeface="Mangal"/>
+        <a:font script="Telu" typeface="Gautami"/>
+        <a:font script="Taml" typeface="Latha"/>
+        <a:font script="Syrc" typeface="Estrangelo Edessa"/>
+        <a:font script="Orya" typeface="Kalinga"/>
+        <a:font script="Mlym" typeface="Kartika"/>
+        <a:font script="Laoo" typeface="DokChampa"/>
+        <a:font script="Sinh" typeface="Iskoola Pota"/>
+        <a:font script="Mong" typeface="Mongolian Baiti"/>
+        <a:font script="Viet" typeface="Times New Roman"/>
+        <a:font script="Uigh" typeface="Microsoft Uighur"/>
+        <a:font script="Geor" typeface="Sylfaen"/>
+        <a:font script="Armn" typeface="Arial"/>
+        <a:font script="Bugi" typeface="Leelawadee UI"/>
+        <a:font script="Bopo" typeface="Microsoft JhengHei"/>
+        <a:font script="Java" typeface="Javanese Text"/>
+        <a:font script="Lisu" typeface="Segoe UI"/>
+        <a:font script="Mymr" typeface="Myanmar Text"/>
+        <a:font script="Nkoo" typeface="Ebrima"/>
+        <a:font script="Olck" typeface="Nirmala UI"/>
+        <a:font script="Osma" typeface="Ebrima"/>
+        <a:font script="Phag" typeface="Phagspa"/>
+        <a:font script="Syrn" typeface="Estrangelo Edessa"/>
+        <a:font script="Syrj" typeface="Estrangelo Edessa"/>
+        <a:font script="Syre" typeface="Estrangelo Edessa"/>
+        <a:font script="Sora" typeface="Nirmala UI"/>
+        <a:font script="Tale" typeface="Microsoft Tai Le"/>
+        <a:font script="Talu" typeface="Microsoft New Tai Lue"/>
+        <a:font script="Tfng" typeface="Ebrima"/>
       </a:majorFont>
       <a:minorFont>
-        <a:latin typeface="Calibri" panose="020F0502020204030204" pitchFamily="0" charset="1"/>
+        <a:latin typeface="Calibri" panose="020F0502020204030204"/>
         <a:ea typeface=""/>
         <a:cs typeface=""/>
+        <a:font script="Jpan" typeface="游明朝"/>
+        <a:font script="Hang" typeface="맑은 고딕"/>
+        <a:font script="Hans" typeface="等线"/>
+        <a:font script="Hant" typeface="新細明體"/>
+        <a:font script="Arab" typeface="Arial"/>
+        <a:font script="Hebr" typeface="Arial"/>
+        <a:font script="Thai" typeface="Cordia New"/>
+        <a:font script="Ethi" typeface="Nyala"/>
+        <a:font script="Beng" typeface="Vrinda"/>
+        <a:font script="Gujr" typeface="Shruti"/>
+        <a:font script="Khmr" typeface="DaunPenh"/>
+        <a:font script="Knda" typeface="Tunga"/>
+        <a:font script="Guru" typeface="Raavi"/>
+        <a:font script="Cans" typeface="Euphemia"/>
+        <a:font script="Cher" typeface="Plantagenet Cherokee"/>
+        <a:font script="Yiii" typeface="Microsoft Yi Baiti"/>
+        <a:font script="Tibt" typeface="Microsoft Himalaya"/>
+        <a:font script="Thaa" typeface="MV Boli"/>
+        <a:font script="Deva" typeface="Mangal"/>
+        <a:font script="Telu" typeface="Gautami"/>
+        <a:font script="Taml" typeface="Latha"/>
+        <a:font script="Syrc" typeface="Estrangelo Edessa"/>
+        <a:font script="Orya" typeface="Kalinga"/>
+        <a:font script="Mlym" typeface="Kartika"/>
+        <a:font script="Laoo" typeface="DokChampa"/>
+        <a:font script="Sinh" typeface="Iskoola Pota"/>
+        <a:font script="Mong" typeface="Mongolian Baiti"/>
+        <a:font script="Viet" typeface="Arial"/>
+        <a:font script="Uigh" typeface="Microsoft Uighur"/>
+        <a:font script="Geor" typeface="Sylfaen"/>
+        <a:font script="Armn" typeface="Arial"/>
+        <a:font script="Bugi" typeface="Leelawadee UI"/>
+        <a:font script="Bopo" typeface="Microsoft JhengHei"/>
+        <a:font script="Java" typeface="Javanese Text"/>
+        <a:font script="Lisu" typeface="Segoe UI"/>
+        <a:font script="Mymr" typeface="Myanmar Text"/>
+        <a:font script="Nkoo" typeface="Ebrima"/>
+        <a:font script="Olck" typeface="Nirmala UI"/>
+        <a:font script="Osma" typeface="Ebrima"/>
+        <a:font script="Phag" typeface="Phagspa"/>
+        <a:font script="Syrn" typeface="Estrangelo Edessa"/>
+        <a:font script="Syrj" typeface="Estrangelo Edessa"/>
+        <a:font script="Syre" typeface="Estrangelo Edessa"/>
+        <a:font script="Sora" typeface="Nirmala UI"/>
+        <a:font script="Tale" typeface="Microsoft Tai Le"/>
+        <a:font script="Talu" typeface="Microsoft New Tai Lue"/>
+        <a:font script="Tfng" typeface="Ebrima"/>
       </a:minorFont>
     </a:fontScheme>
-    <a:fmtScheme>
+    <a:fmtScheme name="Office">
       <a:fillStyleLst>
         <a:solidFill>
           <a:schemeClr val="phClr"/>
         </a:solidFill>
-        <a:gradFill>
+        <a:gradFill rotWithShape="1">
           <a:gsLst>
             <a:gs pos="0">
               <a:schemeClr val="phClr">
                 <a:lumMod val="110000"/>
+                <a:satMod val="105000"/>
                 <a:tint val="67000"/>
               </a:schemeClr>
             </a:gs>
             <a:gs pos="50000">
               <a:schemeClr val="phClr">
                 <a:lumMod val="105000"/>
+                <a:satMod val="103000"/>
                 <a:tint val="73000"/>
               </a:schemeClr>
             </a:gs>
             <a:gs pos="100000">
               <a:schemeClr val="phClr">
                 <a:lumMod val="105000"/>
+                <a:satMod val="109000"/>
                 <a:tint val="81000"/>
               </a:schemeClr>
             </a:gs>
           </a:gsLst>
           <a:lin ang="5400000" scaled="0"/>
-          <a:tileRect l="0" t="0" r="0" b="0"/>
         </a:gradFill>
-        <a:gradFill>
+        <a:gradFill rotWithShape="1">
           <a:gsLst>
             <a:gs pos="0">
               <a:schemeClr val="phClr">
+                <a:satMod val="103000"/>
                 <a:lumMod val="102000"/>
                 <a:tint val="94000"/>
               </a:schemeClr>
             </a:gs>
             <a:gs pos="50000">
               <a:schemeClr val="phClr">
+                <a:satMod val="110000"/>
                 <a:lumMod val="100000"/>
                 <a:shade val="100000"/>
               </a:schemeClr>
@@ -795,24 +1486,33 @@
             <a:gs pos="100000">
               <a:schemeClr val="phClr">
                 <a:lumMod val="99000"/>
+                <a:satMod val="120000"/>
                 <a:shade val="78000"/>
               </a:schemeClr>
             </a:gs>
           </a:gsLst>
           <a:lin ang="5400000" scaled="0"/>
-          <a:tileRect l="0" t="0" r="0" b="0"/>
         </a:gradFill>
       </a:fillStyleLst>
       <a:lnStyleLst>
         <a:ln w="6350" cap="flat" cmpd="sng" algn="ctr">
+          <a:solidFill>
+            <a:schemeClr val="phClr"/>
+          </a:solidFill>
           <a:prstDash val="solid"/>
           <a:miter lim="800000"/>
         </a:ln>
         <a:ln w="12700" cap="flat" cmpd="sng" algn="ctr">
+          <a:solidFill>
+            <a:schemeClr val="phClr"/>
+          </a:solidFill>
           <a:prstDash val="solid"/>
           <a:miter lim="800000"/>
         </a:ln>
         <a:ln w="19050" cap="flat" cmpd="sng" algn="ctr">
+          <a:solidFill>
+            <a:schemeClr val="phClr"/>
+          </a:solidFill>
           <a:prstDash val="solid"/>
           <a:miter lim="800000"/>
         </a:ln>
@@ -825,7 +1525,13 @@
           <a:effectLst/>
         </a:effectStyle>
         <a:effectStyle>
-          <a:effectLst/>
+          <a:effectLst>
+            <a:outerShdw blurRad="57150" dist="19050" dir="5400000" algn="ctr" rotWithShape="0">
+              <a:srgbClr val="000000">
+                <a:alpha val="63000"/>
+              </a:srgbClr>
+            </a:outerShdw>
+          </a:effectLst>
         </a:effectStyle>
       </a:effectStyleLst>
       <a:bgFillStyleLst>
@@ -835,13 +1541,15 @@
         <a:solidFill>
           <a:schemeClr val="phClr">
             <a:tint val="95000"/>
+            <a:satMod val="170000"/>
           </a:schemeClr>
         </a:solidFill>
-        <a:gradFill>
+        <a:gradFill rotWithShape="1">
           <a:gsLst>
             <a:gs pos="0">
               <a:schemeClr val="phClr">
                 <a:tint val="93000"/>
+                <a:satMod val="150000"/>
                 <a:shade val="98000"/>
                 <a:lumMod val="102000"/>
               </a:schemeClr>
@@ -849,6 +1557,7 @@
             <a:gs pos="50000">
               <a:schemeClr val="phClr">
                 <a:tint val="98000"/>
+                <a:satMod val="130000"/>
                 <a:shade val="90000"/>
                 <a:lumMod val="103000"/>
               </a:schemeClr>
@@ -856,14 +1565,21 @@
             <a:gs pos="100000">
               <a:schemeClr val="phClr">
                 <a:shade val="63000"/>
+                <a:satMod val="120000"/>
               </a:schemeClr>
             </a:gs>
           </a:gsLst>
           <a:lin ang="5400000" scaled="0"/>
-          <a:tileRect l="0" t="0" r="0" b="0"/>
         </a:gradFill>
       </a:bgFillStyleLst>
     </a:fmtScheme>
   </a:themeElements>
+  <a:objectDefaults/>
+  <a:extraClrSchemeLst/>
+  <a:extLst>
+    <a:ext uri="{05A4C25C-085E-4340-85A3-A5531E510DB2}">
+      <thm15:themeFamily xmlns:thm15="http://schemas.microsoft.com/office/thememl/2012/main" name="Office Theme" id="{62F939B6-93AF-4DB8-9C6B-D6C7DFDC589F}" vid="{4A3C46E8-61CC-4603-A589-7422A47A8E4A}"/>
+    </a:ext>
+  </a:extLst>
 </a:theme>
 </file>
</xml_diff>